<commit_message>
Add 15-day trial with key-based licensing; remove Bugs Found section from Help/doc
Adds a local (no-backend) 15-day free trial: once it lapses, adding/editing/
deleting data is blocked in favor of a License screen until a valid license
key is entered - viewing, invoices, and backups keep working regardless.
Keys encode customer name + plan (1 year / 5 years / lifetime) with a
signature the app verifies offline; scripts/generate-license.cjs issues them.
DataMasters' add/update handlers now report back whether a write actually
went through, so a blocked attempt no longer shows a false "Successfully
added" toast.

Also removes the "Bugs Found and Fixed" section from the in-app Help tab and
the project doc, renumbering the remaining sections.

Co-Authored-By: Claude Sonnet 5 <noreply@anthropic.com>
</commit_message>
<xml_diff>
--- a/doc/document.docx
+++ b/doc/document.docx
@@ -60,7 +60,7 @@
           <w:color w:val="059669"/>
           <w:sz w:val="36"/>
         </w:rPr>
-        <w:t>1. Bugs Found and Fixed</w:t>
+        <w:t>1. Features Implemented</w:t>
       </w:r>
     </w:p>
     <w:p>
@@ -72,253 +72,7 @@
           <w:color w:val="059669"/>
           <w:sz w:val="28"/>
         </w:rPr>
-        <w:t>1.1 Core Application Logic</w:t>
-      </w:r>
-    </w:p>
-    <w:p>
-      <w:pPr>
-        <w:pStyle w:val="ListBullet"/>
-      </w:pPr>
-      <w:r>
-        <w:rPr>
-          <w:b/>
-        </w:rPr>
-        <w:t xml:space="preserve">Payment override silently did nothing: </w:t>
-      </w:r>
-      <w:r>
-        <w:t>The payment-toggle override was written to a separate, discarded computation and never actually applied — marking an invoice “Paid” had no visible effect anywhere in the app.</w:t>
-      </w:r>
-    </w:p>
-    <w:p>
-      <w:pPr>
-        <w:pStyle w:val="ListBullet"/>
-      </w:pPr>
-      <w:r>
-        <w:rPr>
-          <w:b/>
-        </w:rPr>
-        <w:t xml:space="preserve">Runtime crash on payment confirmation: </w:t>
-      </w:r>
-      <w:r>
-        <w:t>Billing Engine crashed with a ReferenceError (RefreshCw icon used but not imported) the moment an admin tried to confirm a payment status change.</w:t>
-      </w:r>
-    </w:p>
-    <w:p>
-      <w:pPr>
-        <w:pStyle w:val="ListBullet"/>
-      </w:pPr>
-      <w:r>
-        <w:rPr>
-          <w:b/>
-        </w:rPr>
-        <w:t xml:space="preserve">State-mutation bug in cascade delete: </w:t>
-      </w:r>
-      <w:r>
-        <w:t>Deleting a newspaper (Paper) mutated the previous React state object in place instead of creating a new one — an anti-pattern that breaks under React 18/19 Strict Mode's double-invoke checks.</w:t>
-      </w:r>
-    </w:p>
-    <w:p>
-      <w:pPr>
-        <w:pStyle w:val="ListBullet"/>
-      </w:pPr>
-      <w:r>
-        <w:rPr>
-          <w:b/>
-        </w:rPr>
-        <w:t xml:space="preserve">Off-by-one-day bug in bulk delivery-status updates: </w:t>
-      </w:r>
-      <w:r>
-        <w:t>The “Vacation Mode” bulk date-range skip used local-time Date conversion through toISOString(), which silently shifted every date by a full day in any timezone ahead of UTC (confirmed on IST, UTC+5:30) — the end date of a range was dropped entirely.</w:t>
-      </w:r>
-    </w:p>
-    <w:p>
-      <w:pPr>
-        <w:pStyle w:val="ListBullet"/>
-      </w:pPr>
-      <w:r>
-        <w:rPr>
-          <w:b/>
-        </w:rPr>
-        <w:t xml:space="preserve">Invalid phone number format in seed data: </w:t>
-      </w:r>
-      <w:r>
-        <w:t>Seed data generated only 9-digit phone numbers (missing a digit) — an invalid format for Indian mobile numbers, which silently broke WhatsApp's ability to resolve a chat from the share link for every customer except one.</w:t>
-      </w:r>
-    </w:p>
-    <w:p>
-      <w:pPr>
-        <w:pStyle w:val="ListBullet"/>
-      </w:pPr>
-      <w:r>
-        <w:rPr>
-          <w:b/>
-        </w:rPr>
-        <w:t xml:space="preserve">Missing edit/update capability across all Master Ledgers: </w:t>
-      </w:r>
-      <w:r>
-        <w:t>No “Update” capability existed for any master record (Area, Building, Wing, Flat, Paper, Agent) — only Add and Delete, meaning a typo required deleting and recreating a record (destroying its history).</w:t>
-      </w:r>
-    </w:p>
-    <w:p>
-      <w:pPr>
-        <w:pStyle w:val="Heading2"/>
-      </w:pPr>
-      <w:r>
-        <w:rPr>
-          <w:color w:val="059669"/>
-          <w:sz w:val="28"/>
-        </w:rPr>
-        <w:t>1.2 Mobile (Android/Capacitor) Specific</w:t>
-      </w:r>
-    </w:p>
-    <w:p>
-      <w:pPr>
-        <w:pStyle w:val="ListBullet"/>
-      </w:pPr>
-      <w:r>
-        <w:rPr>
-          <w:b/>
-        </w:rPr>
-        <w:t xml:space="preserve">WhatsApp share did not open WhatsApp: </w:t>
-      </w:r>
-      <w:r>
-        <w:t>Both the “Share to WhatsApp” and the app's own “Simulated Android Share Sheet” used target="_blank" links, which Android's embedded WebView silently swallows (no onCreateWindow handler is implemented by default) — taps did nothing.</w:t>
-      </w:r>
-    </w:p>
-    <w:p>
-      <w:pPr>
-        <w:pStyle w:val="ListBullet"/>
-      </w:pPr>
-      <w:r>
-        <w:rPr>
-          <w:b/>
-        </w:rPr>
-        <w:t xml:space="preserve">File downloads silently failed: </w:t>
-      </w:r>
-      <w:r>
-        <w:t>PDF/CSV/backup “downloads” used a plain &lt;a download&gt; blob click, which is a no-op inside an Android WebView (no download manager is wired up without native code).</w:t>
-      </w:r>
-    </w:p>
-    <w:p>
-      <w:pPr>
-        <w:pStyle w:val="ListBullet"/>
-      </w:pPr>
-      <w:r>
-        <w:rPr>
-          <w:b/>
-        </w:rPr>
-        <w:t xml:space="preserve">Print button did nothing: </w:t>
-      </w:r>
-      <w:r>
-        <w:t>window.print() has no effect inside a WebView unless the host Activity explicitly implements Android's PrintManager — which this app's MainActivity did not.</w:t>
-      </w:r>
-    </w:p>
-    <w:p>
-      <w:pPr>
-        <w:pStyle w:val="ListBullet"/>
-      </w:pPr>
-      <w:r>
-        <w:rPr>
-          <w:b/>
-        </w:rPr>
-        <w:t xml:space="preserve">Fake/simulated share flow discovered: </w:t>
-      </w:r>
-      <w:r>
-        <w:t>On investigation, the original “Share/PDF” flow was largely non-functional UI theater: a “Simulated Android Intent Share Sheet” and a “Simulated PDF Dispatch” screen that displayed mock text and performed no real action.</w:t>
-      </w:r>
-    </w:p>
-    <w:p>
-      <w:pPr>
-        <w:pStyle w:val="ListBullet"/>
-      </w:pPr>
-      <w:r>
-        <w:rPr>
-          <w:b/>
-        </w:rPr>
-        <w:t xml:space="preserve">Root cause of continued share failures — missing package-visibility declaration: </w:t>
-      </w:r>
-      <w:r>
-        <w:t>The Android manifest had no &lt;queries&gt; element. On Android 11+, an app cannot see or launch other installed apps (WhatsApp, share targets) via intents unless explicitly declared — this silently broke both the WhatsApp link and any native share sheet, independent of the JS-level fix.</w:t>
-      </w:r>
-    </w:p>
-    <w:p>
-      <w:pPr>
-        <w:pStyle w:val="ListBullet"/>
-      </w:pPr>
-      <w:r>
-        <w:rPr>
-          <w:b/>
-        </w:rPr>
-        <w:t xml:space="preserve">WebView lacked Web Share API support entirely: </w:t>
-      </w:r>
-      <w:r>
-        <w:t>The device's Android System WebView did not implement the Web Share API (navigator.share was undefined), so a first JS-only fix silently fell back to the still-broken legacy code path. Confirmed via on-device logcat analysis before diagnosing correctly.</w:t>
-      </w:r>
-    </w:p>
-    <w:p>
-      <w:pPr>
-        <w:pStyle w:val="ListBullet"/>
-      </w:pPr>
-      <w:r>
-        <w:rPr>
-          <w:b/>
-        </w:rPr>
-        <w:t xml:space="preserve">PDF export was not a real PDF: </w:t>
-      </w:r>
-      <w:r>
-        <w:t>“Downloaded” PDFs were actually plain-text files renamed with a .txt extension, not real binary PDFs.</w:t>
-      </w:r>
-    </w:p>
-    <w:p>
-      <w:pPr>
-        <w:pStyle w:val="ListBullet"/>
-      </w:pPr>
-      <w:r>
-        <w:rPr>
-          <w:b/>
-        </w:rPr>
-        <w:t xml:space="preserve">Two bugs in the real PDF generator, found via direct PDF-content inspection: </w:t>
-      </w:r>
-      <w:r>
-        <w:t>In the first real-PDF implementation, the ₹ (Rupee) symbol rendered as garbled text because jsPDF's default base-14 fonts do not include that Unicode glyph; separately, a typo'd arrow character in a string-split call silently blanked out the customer's address on the PDF.</w:t>
-      </w:r>
-    </w:p>
-    <w:p>
-      <w:pPr>
-        <w:pStyle w:val="ListBullet"/>
-      </w:pPr>
-      <w:r>
-        <w:rPr>
-          <w:b/>
-        </w:rPr>
-        <w:t xml:space="preserve">Generic placeholder app icon: </w:t>
-      </w:r>
-      <w:r>
-        <w:t>The app used the generic default Capacitor/Android-Studio scaffold icon (a teal grid pattern) instead of a branded icon.</w:t>
-      </w:r>
-    </w:p>
-    <w:p>
-      <w:pPr>
-        <w:pStyle w:val="Heading1"/>
-      </w:pPr>
-      <w:r>
-        <w:rPr>
-          <w:color w:val="059669"/>
-          <w:sz w:val="36"/>
-        </w:rPr>
-        <w:t>2. Features Implemented</w:t>
-      </w:r>
-    </w:p>
-    <w:p>
-      <w:pPr>
-        <w:pStyle w:val="Heading2"/>
-      </w:pPr>
-      <w:r>
-        <w:rPr>
-          <w:color w:val="059669"/>
-          <w:sz w:val="28"/>
-        </w:rPr>
-        <w:t>2.1 Application Features</w:t>
+        <w:t>1.1 Application Features</w:t>
       </w:r>
     </w:p>
     <w:p>
@@ -456,7 +210,7 @@
           <w:color w:val="059669"/>
           <w:sz w:val="28"/>
         </w:rPr>
-        <w:t>2.2 Mobile / Native Features</w:t>
+        <w:t>1.2 Mobile / Native Features</w:t>
       </w:r>
     </w:p>
     <w:p>
@@ -538,7 +292,7 @@
           <w:color w:val="059669"/>
           <w:sz w:val="36"/>
         </w:rPr>
-        <w:t>3. Code Quality &amp; Maintainability</w:t>
+        <w:t>2. Code Quality &amp; Maintainability</w:t>
       </w:r>
     </w:p>
     <w:p>
@@ -606,7 +360,7 @@
           <w:color w:val="059669"/>
           <w:sz w:val="36"/>
         </w:rPr>
-        <w:t>4. Testing &amp; Verification</w:t>
+        <w:t>3. Testing &amp; Verification</w:t>
       </w:r>
     </w:p>
     <w:p>
@@ -628,7 +382,7 @@
           <w:color w:val="059669"/>
           <w:sz w:val="28"/>
         </w:rPr>
-        <w:t>4.1 General Workflow Pass — 28 / 28 checks passed</w:t>
+        <w:t>3.1 General Workflow Pass — 28 / 28 checks passed</w:t>
       </w:r>
     </w:p>
     <w:tbl>
@@ -829,7 +583,7 @@
           <w:color w:val="059669"/>
           <w:sz w:val="28"/>
         </w:rPr>
-        <w:t>4.2 Full Customer Journey Pass — 25 / 25 checks passed</w:t>
+        <w:t>3.2 Full Customer Journey Pass — 25 / 25 checks passed</w:t>
       </w:r>
     </w:p>
     <w:p>
@@ -1115,7 +869,7 @@
           <w:color w:val="059669"/>
           <w:sz w:val="36"/>
         </w:rPr>
-        <w:t>5. Notes &amp; Possible Follow-Ups</w:t>
+        <w:t>4. Notes &amp; Possible Follow-Ups</w:t>
       </w:r>
     </w:p>
     <w:p>

</xml_diff>

<commit_message>
Rebrand app to PaperTrack
Renames the app across every surface: in-app UI text, invoice/PDF branding,
WhatsApp/email messages, index.html title, package.json, the project doc,
and the Android app itself (display name, applicationId/namespace changed
from com.dailynewsservice.app to com.papertrack.app, MainActivity moved to
match). The local project folder and GitHub repo are renamed separately.

Co-Authored-By: Claude Sonnet 5 <noreply@anthropic.com>
</commit_message>
<xml_diff>
--- a/doc/document.docx
+++ b/doc/document.docx
@@ -11,7 +11,7 @@
           <w:color w:val="059669"/>
           <w:sz w:val="52"/>
         </w:rPr>
-        <w:t>Daily News Service (New-Papper)</w:t>
+        <w:t>PaperTrack</w:t>
       </w:r>
     </w:p>
     <w:p>
@@ -43,7 +43,7 @@
           <w:i w:val="0"/>
           <w:sz w:val="21"/>
         </w:rPr>
-        <w:t>This document summarizes the bugs found and fixed, features implemented, and end-to-end verification performed on the Daily News Service app — a Capacitor-based Android/web application for managing newspaper delivery routes, subscriptions, and monthly billing across a four-tier location hierarchy (Area → Building → Wing → Flat).</w:t>
+        <w:t>This document summarizes the features implemented and end-to-end verification performed on the PaperTrack app — a Capacitor-based Android/web application for managing newspaper delivery routes, subscriptions, and monthly billing across a four-tier location hierarchy (Area → Building → Wing → Flat).</w:t>
       </w:r>
     </w:p>
     <w:p>

</xml_diff>